<commit_message>
Added all l2 controls to SQL
</commit_message>
<xml_diff>
--- a/02_WorkingDocs/CMMCFledge_Dictonary.docx
+++ b/02_WorkingDocs/CMMCFledge_Dictonary.docx
@@ -2,15 +2,168 @@
 <file path=word/document.xml><?xml version="1.0" encoding="utf-8"?>
 <w:document xmlns:wpc="http://schemas.microsoft.com/office/word/2010/wordprocessingCanvas" xmlns:cx="http://schemas.microsoft.com/office/drawing/2014/chartex" xmlns:cx1="http://schemas.microsoft.com/office/drawing/2015/9/8/chartex" xmlns:cx2="http://schemas.microsoft.com/office/drawing/2015/10/21/chartex" xmlns:cx3="http://schemas.microsoft.com/office/drawing/2016/5/9/chartex" xmlns:cx4="http://schemas.microsoft.com/office/drawing/2016/5/10/chartex" xmlns:cx5="http://schemas.microsoft.com/office/drawing/2016/5/11/chartex" xmlns:cx6="http://schemas.microsoft.com/office/drawing/2016/5/12/chartex" xmlns:cx7="http://schemas.microsoft.com/office/drawing/2016/5/13/chartex" xmlns:cx8="http://schemas.microsoft.com/office/drawing/2016/5/14/chartex" xmlns:mc="http://schemas.openxmlformats.org/markup-compatibility/2006" xmlns:aink="http://schemas.microsoft.com/office/drawing/2016/ink" xmlns:am3d="http://schemas.microsoft.com/office/drawing/2017/model3d" xmlns:o="urn:schemas-microsoft-com:office:office" xmlns:oel="http://schemas.microsoft.com/office/2019/extlst" xmlns:r="http://schemas.openxmlformats.org/officeDocument/2006/relationships" xmlns:m="http://schemas.openxmlformats.org/officeDocument/2006/math" xmlns:v="urn:schemas-microsoft-com:vml" xmlns:wp14="http://schemas.microsoft.com/office/word/2010/wordprocessingDrawing" xmlns:wp="http://schemas.openxmlformats.org/drawingml/2006/wordprocessingDrawing" xmlns:w10="urn:schemas-microsoft-com:office:word" xmlns:w="http://schemas.openxmlformats.org/wordprocessingml/2006/main" xmlns:w14="http://schemas.microsoft.com/office/word/2010/wordml" xmlns:w15="http://schemas.microsoft.com/office/word/2012/wordml" xmlns:w16cex="http://schemas.microsoft.com/office/word/2018/wordml/cex" xmlns:w16cid="http://schemas.microsoft.com/office/word/2016/wordml/cid" xmlns:w16="http://schemas.microsoft.com/office/word/2018/wordml" xmlns:w16du="http://schemas.microsoft.com/office/word/2023/wordml/word16du" xmlns:w16sdtdh="http://schemas.microsoft.com/office/word/2020/wordml/sdtdatahash" xmlns:w16sdtfl="http://schemas.microsoft.com/office/word/2024/wordml/sdtformatlock" xmlns:w16se="http://schemas.microsoft.com/office/word/2015/wordml/symex" xmlns:wpg="http://schemas.microsoft.com/office/word/2010/wordprocessingGroup" xmlns:wpi="http://schemas.microsoft.com/office/word/2010/wordprocessingInk" xmlns:wne="http://schemas.microsoft.com/office/word/2006/wordml" xmlns:wps="http://schemas.microsoft.com/office/word/2010/wordprocessingShape" mc:Ignorable="w14 w15 w16se w16cid w16 w16cex w16sdtdh w16sdtfl w16du wp14">
   <w:body>
-    <w:p>
-      <w:r>
-        <w:t>CMMC - Cybersecurity Maturity Model Certification (CMMC)</w:t>
-      </w:r>
-    </w:p>
-    <w:p/>
-    <w:p>
-      <w:r>
-        <w:t>NIST - National Institute of Standards and Technology is an organization that is part of the department of commerce and tries to promote U.S. Innovation and competition. They create varying levels of standards for different industries.</w:t>
+    <w:p/>
+    <w:p>
+      <w:r>
+        <w:t>Cybersecurity Maturity Model Certification (CMMC)</w:t>
+      </w:r>
+    </w:p>
+    <w:p/>
+    <w:p>
+      <w:r>
+        <w:t>Continuous Monitoring (</w:t>
+      </w:r>
+      <w:proofErr w:type="spellStart"/>
+      <w:r>
+        <w:t>ConMon</w:t>
+      </w:r>
+      <w:proofErr w:type="spellEnd"/>
+      <w:r>
+        <w:t>) Plan</w:t>
+      </w:r>
+    </w:p>
+    <w:p/>
+    <w:p>
+      <w:r>
+        <w:t>Certified 3</w:t>
+      </w:r>
+      <w:r>
+        <w:rPr>
+          <w:vertAlign w:val="superscript"/>
+        </w:rPr>
+        <w:t>rd-</w:t>
+      </w:r>
+      <w:r>
+        <w:t>Party Assessment Organization (</w:t>
+      </w:r>
+      <w:r>
+        <w:t>C3PAO</w:t>
+      </w:r>
+      <w:r>
+        <w:t>)</w:t>
+      </w:r>
+    </w:p>
+    <w:p/>
+    <w:p>
+      <w:r>
+        <w:t>Controlled Unclassified Information (</w:t>
+      </w:r>
+      <w:r>
+        <w:t>CUI</w:t>
+      </w:r>
+      <w:r>
+        <w:t>)</w:t>
+      </w:r>
+    </w:p>
+    <w:p/>
+    <w:p>
+      <w:r>
+        <w:t>Data Flow Diagram</w:t>
+      </w:r>
+      <w:r>
+        <w:t xml:space="preserve"> </w:t>
+      </w:r>
+      <w:r>
+        <w:t>(DFD)</w:t>
+      </w:r>
+    </w:p>
+    <w:p/>
+    <w:p>
+      <w:r>
+        <w:t>External Service Provider</w:t>
+      </w:r>
+      <w:r>
+        <w:t xml:space="preserve"> </w:t>
+      </w:r>
+      <w:r>
+        <w:t xml:space="preserve">ESP </w:t>
+      </w:r>
+      <w:r>
+        <w:t>(</w:t>
+      </w:r>
+      <w:r>
+        <w:t>ESP</w:t>
+      </w:r>
+      <w:r>
+        <w:t>)</w:t>
+      </w:r>
+    </w:p>
+    <w:p/>
+    <w:p>
+      <w:r>
+        <w:t>FedRAMP</w:t>
+      </w:r>
+    </w:p>
+    <w:p/>
+    <w:p>
+      <w:r>
+        <w:t>Federal Contract Information (</w:t>
+      </w:r>
+      <w:r>
+        <w:t>FCI</w:t>
+      </w:r>
+      <w:r>
+        <w:t>)</w:t>
+      </w:r>
+    </w:p>
+    <w:p/>
+    <w:p>
+      <w:r>
+        <w:t>FIPS 140-2</w:t>
+      </w:r>
+    </w:p>
+    <w:p/>
+    <w:p>
+      <w:r>
+        <w:t>FIPS 140-3</w:t>
+      </w:r>
+    </w:p>
+    <w:p/>
+    <w:p>
+      <w:r>
+        <w:t>Incident Response Plan (I</w:t>
+      </w:r>
+      <w:r>
+        <w:t>RP</w:t>
+      </w:r>
+      <w:r>
+        <w:t>)</w:t>
+      </w:r>
+    </w:p>
+    <w:p/>
+    <w:p>
+      <w:r>
+        <w:t xml:space="preserve">National Institute of Standards and Technology </w:t>
+      </w:r>
+      <w:r>
+        <w:t>(</w:t>
+      </w:r>
+      <w:r>
+        <w:t>NIST</w:t>
+      </w:r>
+      <w:r>
+        <w:t>)</w:t>
+      </w:r>
+      <w:r>
+        <w:t xml:space="preserve"> </w:t>
+      </w:r>
+      <w:r>
+        <w:t>–</w:t>
+      </w:r>
+      <w:r>
+        <w:t xml:space="preserve"> </w:t>
+      </w:r>
+      <w:r>
+        <w:t xml:space="preserve">The </w:t>
+      </w:r>
+      <w:r>
+        <w:t xml:space="preserve">National Institute of Standards and Technology </w:t>
+      </w:r>
+      <w:r>
+        <w:t xml:space="preserve">(NIST) </w:t>
+      </w:r>
+      <w:r>
+        <w:t>is an organization that is part of the department of commerce and tries to promote U.S. Innovation and competition. They create varying levels of standards for different industries.</w:t>
       </w:r>
     </w:p>
     <w:p/>
@@ -22,131 +175,58 @@
     <w:p/>
     <w:p>
       <w:r>
+        <w:t>Organization Seeking Certification (OSC)</w:t>
+      </w:r>
+    </w:p>
+    <w:p/>
+    <w:p>
+      <w:r>
+        <w:t>Personal Identifiable Information (</w:t>
+      </w:r>
+      <w:r>
+        <w:t>PII</w:t>
+      </w:r>
+      <w:r>
+        <w:t>)</w:t>
+      </w:r>
+    </w:p>
+    <w:p/>
+    <w:p>
+      <w:r>
+        <w:t>Plan Of Action &amp; Milestones (</w:t>
+      </w:r>
+      <w:r>
         <w:t>POA&amp;M</w:t>
       </w:r>
-    </w:p>
-    <w:p/>
-    <w:p>
-      <w:r>
-        <w:t>C3PAO</w:t>
-      </w:r>
-    </w:p>
-    <w:p/>
-    <w:p>
-      <w:r>
-        <w:t>CUI</w:t>
-      </w:r>
-    </w:p>
-    <w:p/>
-    <w:p>
-      <w:r>
-        <w:t>FCI</w:t>
-      </w:r>
-    </w:p>
-    <w:p/>
-    <w:p>
-      <w:r>
-        <w:t>Organization Seeking Certification (OSC)</w:t>
-      </w:r>
-    </w:p>
-    <w:p/>
-    <w:p>
-      <w:r>
-        <w:t>FIPS 140-2</w:t>
-      </w:r>
-    </w:p>
-    <w:p/>
-    <w:p>
-      <w:r>
-        <w:t>FIPS 140-3</w:t>
-      </w:r>
-    </w:p>
-    <w:p/>
-    <w:p>
-      <w:r>
-        <w:t>PII</w:t>
-      </w:r>
-    </w:p>
-    <w:p/>
-    <w:p>
-      <w:r>
-        <w:t>PCI</w:t>
-      </w:r>
-    </w:p>
-    <w:p/>
-    <w:p>
+      <w:r>
+        <w:t>)</w:t>
+      </w:r>
+    </w:p>
+    <w:p/>
+    <w:p>
+      <w:r>
+        <w:t>Security Assessment Report (</w:t>
+      </w:r>
+      <w:r>
+        <w:t>SAR</w:t>
+      </w:r>
+      <w:r>
+        <w:t>)</w:t>
+      </w:r>
+    </w:p>
+    <w:p/>
+    <w:p>
+      <w:r>
+        <w:t>System Security Plan (</w:t>
+      </w:r>
       <w:r>
         <w:t>SSP</w:t>
       </w:r>
-    </w:p>
-    <w:p/>
-    <w:p>
-      <w:r>
-        <w:t>OSC</w:t>
-      </w:r>
-    </w:p>
-    <w:p/>
-    <w:p>
-      <w:r>
-        <w:t>SAR</w:t>
-      </w:r>
-    </w:p>
-    <w:p/>
-    <w:p>
-      <w:r>
-        <w:t>IRP</w:t>
-      </w:r>
-    </w:p>
-    <w:p/>
-    <w:p>
-      <w:proofErr w:type="spellStart"/>
-      <w:r>
-        <w:t>ConMon</w:t>
-      </w:r>
-      <w:proofErr w:type="spellEnd"/>
-    </w:p>
-    <w:p/>
-    <w:p>
-      <w:r>
-        <w:t>FedRAMP (need for things like equivalency)</w:t>
-      </w:r>
-    </w:p>
-    <w:p/>
-    <w:p>
-      <w:r>
-        <w:t>DFD (Data F</w:t>
-      </w:r>
-      <w:r>
-        <w:t>l</w:t>
-      </w:r>
-      <w:r>
-        <w:t>ow Diagram)</w:t>
-      </w:r>
-    </w:p>
-    <w:p/>
-    <w:p>
-      <w:r>
-        <w:t>ESP (External Service Provider)</w:t>
-      </w:r>
-    </w:p>
-    <w:p/>
-    <w:p>
-      <w:r>
-        <w:t>Inheritance</w:t>
-      </w:r>
-    </w:p>
-    <w:p/>
-    <w:p>
-      <w:r>
-        <w:t>Shared Responsibilities</w:t>
-      </w:r>
-    </w:p>
-    <w:p/>
-    <w:p>
-      <w:r>
-        <w:t>Fully inherited Responsibilities</w:t>
-      </w:r>
-    </w:p>
+      <w:r>
+        <w:t>)</w:t>
+      </w:r>
+    </w:p>
+    <w:p/>
     <w:sectPr>
       <w:pgSz w:w="12240" w:h="15840"/>
       <w:pgMar w:top="1440" w:right="1440" w:bottom="1440" w:left="1440" w:header="720" w:footer="720" w:gutter="0"/>

</xml_diff>